<commit_message>
Add family-relevant reference photos to the 16 maintenance manuals
Each manual now includes two reference images instead of text only: a
general station-overview photo right under the station ID line, and an
electrical-cabinet photo after the "MANTENIMIENTO ELEMENTOS ELECTRICO"
heading. Moose/Scorpion stations use the STTOR family photos, GECKO
stations use STGECKO/GECKO photos, since no station-specific photo
exists for each of the 16 individually -- captions note they're family
reference photos, not the exact physical unit.
</commit_message>
<xml_diff>
--- a/documentos_terminados/Manuales_Mantenimiento/Manual_Mantenimiento_Ampseal_Attach_Gecko.docx
+++ b/documentos_terminados/Manuales_Mantenimiento/Manual_Mantenimiento_Ampseal_Attach_Gecko.docx
@@ -255,6 +255,51 @@
         </w:rPr>
         <w:tab/>
         <w:t>Estación / Nombre de máquina: Ampseal Attach Gecko        Número de serie: VSS1H-6050-002</w:t>
+      </w:r>
+    </w:p>
+    <w:p>
+      <w:r>
+        <w:drawing>
+          <wp:inline xmlns:a="http://schemas.openxmlformats.org/drawingml/2006/main" xmlns:pic="http://schemas.openxmlformats.org/drawingml/2006/picture">
+            <wp:extent cx="2926080" cy="1645920"/>
+            <wp:docPr id="1468374309" name="Picture 1468374309"/>
+            <wp:cNvGraphicFramePr>
+              <a:graphicFrameLocks noChangeAspect="1"/>
+            </wp:cNvGraphicFramePr>
+            <a:graphic>
+              <a:graphicData uri="http://schemas.openxmlformats.org/drawingml/2006/picture">
+                <pic:pic>
+                  <pic:nvPicPr>
+                    <pic:cNvPr id="0" name="STGECKO ISOMETRICO DE LA MAQUINA.png"/>
+                    <pic:cNvPicPr/>
+                  </pic:nvPicPr>
+                  <pic:blipFill>
+                    <a:blip r:embed="rId15"/>
+                    <a:stretch>
+                      <a:fillRect/>
+                    </a:stretch>
+                  </pic:blipFill>
+                  <pic:spPr>
+                    <a:xfrm>
+                      <a:off x="0" y="0"/>
+                      <a:ext cx="2926080" cy="1645920"/>
+                    </a:xfrm>
+                    <a:prstGeom prst="rect"/>
+                  </pic:spPr>
+                </pic:pic>
+              </a:graphicData>
+            </a:graphic>
+          </wp:inline>
+        </w:drawing>
+      </w:r>
+    </w:p>
+    <w:p>
+      <w:r>
+        <w:rPr>
+          <w:i/>
+          <w:sz w:val="16"/>
+        </w:rPr>
+        <w:t>Foto de referencia: estación tipo de la familia (no necesariamente la unidad física VSS1H-6050-002).</w:t>
       </w:r>
     </w:p>
     <w:p>
@@ -2478,6 +2523,51 @@
           <w:bCs/>
         </w:rPr>
         <w:t>MANTENIMIENTO ELEMENTOS ELÉCTRICO</w:t>
+      </w:r>
+    </w:p>
+    <w:p>
+      <w:r>
+        <w:drawing>
+          <wp:inline xmlns:a="http://schemas.openxmlformats.org/drawingml/2006/main" xmlns:pic="http://schemas.openxmlformats.org/drawingml/2006/picture">
+            <wp:extent cx="2743200" cy="2202668"/>
+            <wp:docPr id="1468374310" name="Picture 1468374310"/>
+            <wp:cNvGraphicFramePr>
+              <a:graphicFrameLocks noChangeAspect="1"/>
+            </wp:cNvGraphicFramePr>
+            <a:graphic>
+              <a:graphicData uri="http://schemas.openxmlformats.org/drawingml/2006/picture">
+                <pic:pic>
+                  <pic:nvPicPr>
+                    <pic:cNvPr id="0" name="GECKO GABINETE ELECTRICO.png"/>
+                    <pic:cNvPicPr/>
+                  </pic:nvPicPr>
+                  <pic:blipFill>
+                    <a:blip r:embed="rId16"/>
+                    <a:stretch>
+                      <a:fillRect/>
+                    </a:stretch>
+                  </pic:blipFill>
+                  <pic:spPr>
+                    <a:xfrm>
+                      <a:off x="0" y="0"/>
+                      <a:ext cx="2743200" cy="2202668"/>
+                    </a:xfrm>
+                    <a:prstGeom prst="rect"/>
+                  </pic:spPr>
+                </pic:pic>
+              </a:graphicData>
+            </a:graphic>
+          </wp:inline>
+        </w:drawing>
+      </w:r>
+    </w:p>
+    <w:p>
+      <w:r>
+        <w:rPr>
+          <w:i/>
+          <w:sz w:val="16"/>
+        </w:rPr>
+        <w:t>Foto de referencia: gabinete/panel eléctrico tipo de la familia.</w:t>
       </w:r>
     </w:p>
     <w:p>

</xml_diff>